<commit_message>
docs: update BAB III DOCX with 5 detailed activity diagrams and paragraphs
</commit_message>
<xml_diff>
--- a/be-rongsok/docs/BAB_III_Metodologi_Pengembangan.docx
+++ b/be-rongsok/docs/BAB_III_Metodologi_Pengembangan.docx
@@ -423,7 +423,7 @@
         <w:br/>
         <w:t>1. Pengguna berinteraksi langsung dengan antarmuka Next.js yang teroptimasi secara mobile-first.</w:t>
         <w:br/>
-        <w:t>2. Next.js melakukan komunikasi asinkron dengan REST API Express.js melalui pengiriman token JWT di dalam authorization header. Koneksi Socket.IO dipertahankan untuk lalu lintas notifikasi real-time.</w:t>
+        <w:t>2. Next.js melakukan komunikasi asinkron dengan REST API Express.js melalui pengiriman token JWT di dalam authorization header. Koneksi Socket.IO dipertahankan untuk lalu intratif real-time.</w:t>
         <w:br/>
         <w:t>3. File gambar biner diunggah langsung dari frontend Next.js ke Cloudinary Storage (Client-side upload) untuk meringankan beban server API. Cloudinary mengembalikan URL gambar statis.</w:t>
         <w:br/>
@@ -493,7 +493,7 @@
         <w:br/>
         <w:t xml:space="preserve">                 ──► [ UC-02: Mengelola Profil Diri &amp; Unggah Avatar ]</w:t>
         <w:br/>
-        <w:t xml:space="preserve">                 ──► [ UC-03: Mencari Pengepul Sampah Terdekat (Radius) ]</w:t>
+        <w:t xml:space="preserve">                 ──► [ UC-03: Cari Pengepul Sampah Terdekat (Radius) ]</w:t>
         <w:br/>
         <w:t xml:space="preserve">                 ──► [ UC-04: Membuat Pesanan Sampah (Jemput/Antar) ]</w:t>
         <w:br/>
@@ -540,123 +540,319 @@
     </w:p>
     <w:p>
       <w:r>
-        <w:t>Activity Diagram menggambarkan alur aktivitas transaksi daur ulang end-to-end yang berjalan di dalam platform, dimulai dari pengajuan pesanan oleh Customer hingga transaksi selesai dan struk diterbitkan:</w:t>
+        <w:t>Alur aktivitas transaksi daur ulang rongsokan pada platform Rongsok.in dipecah menjadi lima diagram aktivitas utama untuk memberikan visualisasi yang mendalam dan berfokus pada peran masing-masing aktor serta logika sistem di setiap fasenya. Masing-masing alur aktivitas tersebut dijelaskan sebagai berikut:</w:t>
       </w:r>
     </w:p>
     <w:p>
       <w:pPr>
-        <w:spacing w:line="240" w:lineRule="auto"/>
+        <w:keepNext/>
+        <w:spacing w:before="120" w:after="80"/>
         <w:jc w:val="left"/>
       </w:pPr>
       <w:r>
         <w:rPr>
-          <w:rFonts w:ascii="Consolas" w:hAnsi="Consolas"/>
+          <w:rFonts w:ascii="Times New Roman" w:hAnsi="Times New Roman"/>
           <w:b/>
-          <w:sz w:val="17"/>
+          <w:color w:val="374151"/>
+          <w:sz w:val="24"/>
         </w:rPr>
-        <w:t xml:space="preserve"> 👤 CUSTOMER                           🖥️ SISTEM                             🏪 PENGEPUL</w:t>
-        <w:br/>
-        <w:t>┌───────────┐                         ┌──────────┐                         ┌───────────┐</w:t>
-        <w:br/>
-        <w:t>│Isi Form   │ ──(Submit Order)──────► │Hitung    │                         │           │</w:t>
-        <w:br/>
-        <w:t>│&amp; Upload   │                         │Radius    │                         │           │</w:t>
-        <w:br/>
-        <w:t>│Foto       │                         │PostGIS   │                         │           │</w:t>
-        <w:br/>
-        <w:t>└───────────┘                         └────┬─────┘                         └───────────┘</w:t>
-        <w:br/>
-        <w:t xml:space="preserve">                                           │                                     </w:t>
-        <w:br/>
-        <w:t xml:space="preserve">                                     (Broadcast SIO)                             </w:t>
-        <w:br/>
-        <w:t xml:space="preserve">                                           │                                     </w:t>
-        <w:br/>
-        <w:t xml:space="preserve">                                           ▼                                     </w:t>
-        <w:br/>
-        <w:t xml:space="preserve">                                      ┌──────────┐                         ┌───────────┐</w:t>
-        <w:br/>
-        <w:t xml:space="preserve">                                      │Teruskan  │ ──(Terima Notif)──────► │Terima atau│</w:t>
-        <w:br/>
-        <w:t xml:space="preserve">                                      │Notifikasi│                         │Tolak Order│</w:t>
-        <w:br/>
-        <w:t xml:space="preserve">                                      └──────────┘                         └─────┬─────┘</w:t>
-        <w:br/>
-        <w:t xml:space="preserve">                                                                                 │</w:t>
-        <w:br/>
-        <w:t xml:space="preserve">                                                                             (Menerima)</w:t>
-        <w:br/>
-        <w:t xml:space="preserve">                                                                                 │</w:t>
-        <w:br/>
-        <w:t xml:space="preserve">                                                                                 ▼</w:t>
-        <w:br/>
-        <w:t xml:space="preserve">                                                                           ┌───────────┐</w:t>
-        <w:br/>
-        <w:t xml:space="preserve">                                                                           │Jemput ke  │</w:t>
-        <w:br/>
-        <w:t xml:space="preserve">                                                                           │Lokasi &amp;   │</w:t>
-        <w:br/>
-        <w:t xml:space="preserve">                                                                           │Timbang    │</w:t>
-        <w:br/>
-        <w:t xml:space="preserve">                                                                           └─────┬─────┘</w:t>
-        <w:br/>
-        <w:t xml:space="preserve">                                                                                 │</w:t>
-        <w:br/>
-        <w:t xml:space="preserve">                                                                             (Timbang)</w:t>
-        <w:br/>
-        <w:t xml:space="preserve">                                                                                 │</w:t>
-        <w:br/>
-        <w:t xml:space="preserve">                                                                                 ▼</w:t>
-        <w:br/>
-        <w:t xml:space="preserve">                                      ┌──────────┐                         ┌───────────┐</w:t>
-        <w:br/>
-        <w:t xml:space="preserve">                                      │Simpan    │ ◄──(Kirim Input Berat &amp; │Kirim Input│</w:t>
-        <w:br/>
-        <w:t xml:space="preserve">                                      │Foto Bukti│    Bukti Timbangan)     │Berat &amp;    │</w:t>
-        <w:br/>
-        <w:t xml:space="preserve">                                      │Timbangan │                         │Foto Bukti │</w:t>
-        <w:br/>
-        <w:t xml:space="preserve">                                      └────┬─────┘                         └───────────┘</w:t>
-        <w:br/>
-        <w:t xml:space="preserve">                                           │                                     </w:t>
-        <w:br/>
-        <w:t xml:space="preserve">                                     (Notifikasi)                                </w:t>
-        <w:br/>
-        <w:t xml:space="preserve">                                           │                                     </w:t>
-        <w:br/>
-        <w:t xml:space="preserve">                                           ▼                                     </w:t>
-        <w:br/>
-        <w:t>┌───────────┐                         ┌──────────┐                         ┌───────────┐</w:t>
-        <w:br/>
-        <w:t>│Setujui &amp;  │ ──(Konfirmasi)────────► │Ubah      │                         │           │</w:t>
-        <w:br/>
-        <w:t>│Selesaikan │                         │Status    │                         │           │</w:t>
-        <w:br/>
-        <w:t>│Transaksi  │                         │Order     │                         │           │</w:t>
-        <w:br/>
-        <w:t>└─────┬─────┘                         └────┬─────┘                         └───────────┘</w:t>
-        <w:br/>
-        <w:t xml:space="preserve">      │                                    │                                     </w:t>
-        <w:br/>
-        <w:t xml:space="preserve">   (Beri)                               (Cetak                                   </w:t>
-        <w:br/>
-        <w:t xml:space="preserve">   Rating                               Receipt)                                 </w:t>
-        <w:br/>
-        <w:t xml:space="preserve">      │                                    │                                     </w:t>
-        <w:br/>
-        <w:t xml:space="preserve">      ▼                                    ▼                                     </w:t>
-        <w:br/>
-        <w:t>┌───────────┐                         ┌──────────┐                         ┌───────────┐</w:t>
-        <w:br/>
-        <w:t>│Beri Rating│                         │Terbitkan │                         │Beri Rating│</w:t>
-        <w:br/>
-        <w:t>│&amp; Upload   │ ──(Kirim Ulasan)──────► │Digital   │ ◄──(Kirim Ulasan)────── │Kualitas   │</w:t>
-        <w:br/>
-        <w:t>│Foto       │                         │Receipt   │                         │Sampah     │</w:t>
-        <w:br/>
-        <w:t>└───────────┘                         └──────────┘                         └───────────┘</w:t>
+        <w:t>1. Pembuatan Pesanan Customer</w:t>
       </w:r>
     </w:p>
+    <w:p>
+      <w:r>
+        <w:t>Diagram aktivitas pertama ini memodelkan seluruh aktivitas awal yang dilakukan oleh aktor Customer ketika ingin menjual barang rongsokan. Alur kerja dimulai saat Customer membuka halaman pembuatan pesanan pada aplikasi, dilanjutkan dengan memasukkan perkiraan estimasi berat barang (dalam kilogram), mengunggah foto kondisi fisik sampah, serta memilih metode penyerahan transaksi (apakah Minta Jemput/Pick-up ataupun Antar Sendiri/Drop-off). Sebelum formulir dikirim, sistem akan meminta otorisasi akses geolocation API pada browser/smartphone untuk merekam titik koordinat GPS presisi dari Customer demi memudahkan pengepul melakukan navigasi ke lokasi penjemputan.</w:t>
+      </w:r>
+    </w:p>
+    <w:p>
+      <w:pPr>
+        <w:spacing w:before="120" w:after="120"/>
+        <w:jc w:val="center"/>
+      </w:pPr>
+      <w:r>
+        <w:drawing>
+          <wp:inline xmlns:a="http://schemas.openxmlformats.org/drawingml/2006/main" xmlns:pic="http://schemas.openxmlformats.org/drawingml/2006/picture">
+            <wp:extent cx="3840480" cy="4840685"/>
+            <wp:docPr id="1" name="Picture 1"/>
+            <wp:cNvGraphicFramePr>
+              <a:graphicFrameLocks noChangeAspect="1"/>
+            </wp:cNvGraphicFramePr>
+            <a:graphic>
+              <a:graphicData uri="http://schemas.openxmlformats.org/drawingml/2006/picture">
+                <pic:pic>
+                  <pic:nvPicPr>
+                    <pic:cNvPr id="0" name="1. Pembuatan Pesanan Customer.png"/>
+                    <pic:cNvPicPr/>
+                  </pic:nvPicPr>
+                  <pic:blipFill>
+                    <a:blip r:embed="rId9"/>
+                    <a:stretch>
+                      <a:fillRect/>
+                    </a:stretch>
+                  </pic:blipFill>
+                  <pic:spPr>
+                    <a:xfrm>
+                      <a:off x="0" y="0"/>
+                      <a:ext cx="3840480" cy="4840685"/>
+                    </a:xfrm>
+                    <a:prstGeom prst="rect"/>
+                  </pic:spPr>
+                </pic:pic>
+              </a:graphicData>
+            </a:graphic>
+          </wp:inline>
+        </w:drawing>
+      </w:r>
+    </w:p>
+    <w:p/>
+    <w:p>
+      <w:pPr>
+        <w:keepNext/>
+        <w:spacing w:before="120" w:after="80"/>
+        <w:jc w:val="left"/>
+      </w:pPr>
+      <w:r>
+        <w:rPr>
+          <w:rFonts w:ascii="Times New Roman" w:hAnsi="Times New Roman"/>
+          <w:b/>
+          <w:color w:val="374151"/>
+          <w:sz w:val="24"/>
+        </w:rPr>
+        <w:t>2. Proses Sistem (Backend Matching)</w:t>
+      </w:r>
+    </w:p>
+    <w:p>
+      <w:r>
+        <w:t>Diagram aktivitas kedua ini menggambarkan rangkaian aktivitas internal terotomatisasi di sisi server (backend) saat menanggapi pembuatan pesanan baru. Sistem pertama-tama mengunggah file foto sampah secara asinkron ke Cloudinary Storage dan memverifikasi token JWT untuk mengautentikasi identitas Customer. Selanjutnya, backend mengeksekusi spatial query PostgreSQL/PostGIS menggunakan fungsi ST_DWithin dan ST_Distance untuk menyaring daftar pengepul aktif dalam radius jangkauan. Jika pengepul yang sesuai ditemukan, sistem akan menyimpan record order dengan status PENDING dan mem-broadcast rincian notifikasi tersebut via Socket.IO ke room pengepul terkait. Namun, jika tidak ada pengepul aktif, sistem akan langsung mengirimkan respon notifikasi ke halaman Customer bahwa pengepul di sekitar area tersebut sedang sibuk atau tidak tersedia.</w:t>
+      </w:r>
+    </w:p>
+    <w:p>
+      <w:pPr>
+        <w:spacing w:before="120" w:after="120"/>
+        <w:jc w:val="center"/>
+      </w:pPr>
+      <w:r>
+        <w:drawing>
+          <wp:inline xmlns:a="http://schemas.openxmlformats.org/drawingml/2006/main" xmlns:pic="http://schemas.openxmlformats.org/drawingml/2006/picture">
+            <wp:extent cx="4114800" cy="3191733"/>
+            <wp:docPr id="2" name="Picture 2"/>
+            <wp:cNvGraphicFramePr>
+              <a:graphicFrameLocks noChangeAspect="1"/>
+            </wp:cNvGraphicFramePr>
+            <a:graphic>
+              <a:graphicData uri="http://schemas.openxmlformats.org/drawingml/2006/picture">
+                <pic:pic>
+                  <pic:nvPicPr>
+                    <pic:cNvPr id="0" name="2. Proses Sistem (Backend Matching).png"/>
+                    <pic:cNvPicPr/>
+                  </pic:nvPicPr>
+                  <pic:blipFill>
+                    <a:blip r:embed="rId10"/>
+                    <a:stretch>
+                      <a:fillRect/>
+                    </a:stretch>
+                  </pic:blipFill>
+                  <pic:spPr>
+                    <a:xfrm>
+                      <a:off x="0" y="0"/>
+                      <a:ext cx="4114800" cy="3191733"/>
+                    </a:xfrm>
+                    <a:prstGeom prst="rect"/>
+                  </pic:spPr>
+                </pic:pic>
+              </a:graphicData>
+            </a:graphic>
+          </wp:inline>
+        </w:drawing>
+      </w:r>
+    </w:p>
+    <w:p/>
+    <w:p>
+      <w:pPr>
+        <w:keepNext/>
+        <w:spacing w:before="120" w:after="80"/>
+        <w:jc w:val="left"/>
+      </w:pPr>
+      <w:r>
+        <w:rPr>
+          <w:rFonts w:ascii="Times New Roman" w:hAnsi="Times New Roman"/>
+          <w:b/>
+          <w:color w:val="374151"/>
+          <w:sz w:val="24"/>
+        </w:rPr>
+        <w:t>3. Penanganan Order oleh Pengepul</w:t>
+      </w:r>
+    </w:p>
+    <w:p>
+      <w:r>
+        <w:t>Diagram aktivitas ketiga memfokuskan alur pada aktivitas yang terjadi pada aktor Pengepul (Collector) saat menerima penawaran pesanan. Pengepul menerima notifikasi secara real-time melalui koneksi WebSockets Socket.IO dan dihadapkan pada keputusan untuk mengambil (terima) atau menolak pesanan tersebut. Jika diabaikan atau ditolak, alur berakhir untuk pengepul tersebut. Jika diterima, status pesanan diperbarui menjadi CONFIRMED, dan pengepul segera bergerak menuju lokasi Customer. Setelah sampai di titik koordinat, pengepul menimbang sampah menggunakan timbangan digital fisik, memasukkan data berat aktual ke dalam aplikasi, serta mengunggah bukti visual timbangan atau nota tulis (transactionProofUrl) guna meminimalkan sengketa data, sebelum akhirnya mengirimkan harga transaksi final ke sistem.</w:t>
+      </w:r>
+    </w:p>
+    <w:p>
+      <w:pPr>
+        <w:spacing w:before="120" w:after="120"/>
+        <w:jc w:val="center"/>
+      </w:pPr>
+      <w:r>
+        <w:drawing>
+          <wp:inline xmlns:a="http://schemas.openxmlformats.org/drawingml/2006/main" xmlns:pic="http://schemas.openxmlformats.org/drawingml/2006/picture">
+            <wp:extent cx="3840480" cy="4939485"/>
+            <wp:docPr id="3" name="Picture 3"/>
+            <wp:cNvGraphicFramePr>
+              <a:graphicFrameLocks noChangeAspect="1"/>
+            </wp:cNvGraphicFramePr>
+            <a:graphic>
+              <a:graphicData uri="http://schemas.openxmlformats.org/drawingml/2006/picture">
+                <pic:pic>
+                  <pic:nvPicPr>
+                    <pic:cNvPr id="0" name="3. Penanganan Order oleh Pengepul.png"/>
+                    <pic:cNvPicPr/>
+                  </pic:nvPicPr>
+                  <pic:blipFill>
+                    <a:blip r:embed="rId11"/>
+                    <a:stretch>
+                      <a:fillRect/>
+                    </a:stretch>
+                  </pic:blipFill>
+                  <pic:spPr>
+                    <a:xfrm>
+                      <a:off x="0" y="0"/>
+                      <a:ext cx="3840480" cy="4939485"/>
+                    </a:xfrm>
+                    <a:prstGeom prst="rect"/>
+                  </pic:spPr>
+                </pic:pic>
+              </a:graphicData>
+            </a:graphic>
+          </wp:inline>
+        </w:drawing>
+      </w:r>
+    </w:p>
+    <w:p/>
+    <w:p>
+      <w:pPr>
+        <w:keepNext/>
+        <w:spacing w:before="120" w:after="80"/>
+        <w:jc w:val="left"/>
+      </w:pPr>
+      <w:r>
+        <w:rPr>
+          <w:rFonts w:ascii="Times New Roman" w:hAnsi="Times New Roman"/>
+          <w:b/>
+          <w:color w:val="374151"/>
+          <w:sz w:val="24"/>
+        </w:rPr>
+        <w:t>4. Konfirmasi &amp; Penyelesaian Transaksi</w:t>
+      </w:r>
+    </w:p>
+    <w:p>
+      <w:r>
+        <w:t>Diagram aktivitas keempat mendeskripsikan proses validasi akhir dan penyelesaian finansial di sisi Customer. Saat Pengepul selesai mengirimkan data berat dan harga final, Customer menerima notifikasi rincian nota digital di layar perangkat mereka. Jika Customer tidak setuju dengan hasil timbangan, Customer dapat melakukan negosiasi manual di lapangan dan meminta penimbangan ulang barang rongsokan. Namun, jika Customer menyetujui detail berat dan nominal tersebut, Customer akan mengonfirmasi transaksi dan melakukan transaksi pembayaran. Sistem selanjutnya memperbarui status pesanan menjadi COMPLETED, menerbitkan record struk digital permanen (Receipt) yang mengikat data transaksi dan foto bukti timbangan, serta mengirimkan struk digital tersebut kepada kedua pihak.</w:t>
+      </w:r>
+    </w:p>
+    <w:p>
+      <w:pPr>
+        <w:spacing w:before="120" w:after="120"/>
+        <w:jc w:val="center"/>
+      </w:pPr>
+      <w:r>
+        <w:drawing>
+          <wp:inline xmlns:a="http://schemas.openxmlformats.org/drawingml/2006/main" xmlns:pic="http://schemas.openxmlformats.org/drawingml/2006/picture">
+            <wp:extent cx="3840480" cy="3568243"/>
+            <wp:docPr id="4" name="Picture 4"/>
+            <wp:cNvGraphicFramePr>
+              <a:graphicFrameLocks noChangeAspect="1"/>
+            </wp:cNvGraphicFramePr>
+            <a:graphic>
+              <a:graphicData uri="http://schemas.openxmlformats.org/drawingml/2006/picture">
+                <pic:pic>
+                  <pic:nvPicPr>
+                    <pic:cNvPr id="0" name="4. Konfirmasi &amp; Penyelesaian Transaksi.png"/>
+                    <pic:cNvPicPr/>
+                  </pic:nvPicPr>
+                  <pic:blipFill>
+                    <a:blip r:embed="rId12"/>
+                    <a:stretch>
+                      <a:fillRect/>
+                    </a:stretch>
+                  </pic:blipFill>
+                  <pic:spPr>
+                    <a:xfrm>
+                      <a:off x="0" y="0"/>
+                      <a:ext cx="3840480" cy="3568243"/>
+                    </a:xfrm>
+                    <a:prstGeom prst="rect"/>
+                  </pic:spPr>
+                </pic:pic>
+              </a:graphicData>
+            </a:graphic>
+          </wp:inline>
+        </w:drawing>
+      </w:r>
+    </w:p>
+    <w:p/>
+    <w:p>
+      <w:pPr>
+        <w:keepNext/>
+        <w:spacing w:before="120" w:after="80"/>
+        <w:jc w:val="left"/>
+      </w:pPr>
+      <w:r>
+        <w:rPr>
+          <w:rFonts w:ascii="Times New Roman" w:hAnsi="Times New Roman"/>
+          <w:b/>
+          <w:color w:val="374151"/>
+          <w:sz w:val="24"/>
+        </w:rPr>
+        <w:t>5. Review &amp; Penutupan</w:t>
+      </w:r>
+    </w:p>
+    <w:p>
+      <w:r>
+        <w:t>Diagram aktivitas kelima sekaligus penutup menggambarkan alur pasca-transaksi yang dirancang untuk membangun reputasi dan transparansi ekosistem daur ulang melalui Mutual Rating. Setelah transaksi dikonfirmasi selesai (status COMPLETED), antarmuka platform Rongsok.in secara otomatis memicu pop-up ulasan. Customer memberikan penilaian bintang 1 s.d. 5, ulasan tertulis, serta melampirkan foto pelayanan pengepul (photoUrl). Di sisi lain, Pengepul juga memberikan penilaian berupa rating bintang terhadap kebersihan sampah serta keakuratan deskripsi yang dibuat oleh Customer guna menjamin keadilan ekosistem marketplace daur ulang.</w:t>
+      </w:r>
+    </w:p>
+    <w:p>
+      <w:pPr>
+        <w:spacing w:before="120" w:after="120"/>
+        <w:jc w:val="center"/>
+      </w:pPr>
+      <w:r>
+        <w:drawing>
+          <wp:inline xmlns:a="http://schemas.openxmlformats.org/drawingml/2006/main" xmlns:pic="http://schemas.openxmlformats.org/drawingml/2006/picture">
+            <wp:extent cx="3200400" cy="3130558"/>
+            <wp:docPr id="5" name="Picture 5"/>
+            <wp:cNvGraphicFramePr>
+              <a:graphicFrameLocks noChangeAspect="1"/>
+            </wp:cNvGraphicFramePr>
+            <a:graphic>
+              <a:graphicData uri="http://schemas.openxmlformats.org/drawingml/2006/picture">
+                <pic:pic>
+                  <pic:nvPicPr>
+                    <pic:cNvPr id="0" name=" 5. Review &amp; Penutupan.png"/>
+                    <pic:cNvPicPr/>
+                  </pic:nvPicPr>
+                  <pic:blipFill>
+                    <a:blip r:embed="rId13"/>
+                    <a:stretch>
+                      <a:fillRect/>
+                    </a:stretch>
+                  </pic:blipFill>
+                  <pic:spPr>
+                    <a:xfrm>
+                      <a:off x="0" y="0"/>
+                      <a:ext cx="3200400" cy="3130558"/>
+                    </a:xfrm>
+                    <a:prstGeom prst="rect"/>
+                  </pic:spPr>
+                </pic:pic>
+              </a:graphicData>
+            </a:graphic>
+          </wp:inline>
+        </w:drawing>
+      </w:r>
+    </w:p>
+    <w:p/>
     <w:p>
       <w:pPr>
         <w:keepNext/>

</xml_diff>

<commit_message>
Update docs, architecture, flow, and use case diagrams
</commit_message>
<xml_diff>
--- a/be-rongsok/docs/BAB_III_Metodologi_Pengembangan.docx
+++ b/be-rongsok/docs/BAB_III_Metodologi_Pengembangan.docx
@@ -366,7 +366,7 @@
     </w:p>
     <w:p>
       <w:r>
-        <w:t>Rongsok.in mengadopsi arsitektur Client-Server modern berbasis JavaScript end-to-end (Full-stack JS). Pemisahan tanggung jawab secara tegas antara frontend (Client-side) dan backend (Server-side) dilakukan guna memaksimalkan skalabilitas serta kecepatan pengembangan.</w:t>
+        <w:t>Rongsok.in mengadopsi arsitektur Client-Server modern berbasis JavaScript end-to-end (Full-stack JS) yang terintegrasi secara modular dengan infrastruktur deployment production-grade. Pemisahan tanggung jawab secara tegas antara Frontend Layer (Client-side) dan Backend API Layer (Server-side) dilakukan guna memaksimalkan keandalan (reliability), skalabilitas, serta kecepatan siklus pengembangan, sekaligus memfasilitasi integrasi pengantaran layanan (deployment pipeline) yang aman.</w:t>
       </w:r>
     </w:p>
     <w:p>
@@ -374,60 +374,71 @@
         <w:spacing w:line="240" w:lineRule="auto"/>
         <w:jc w:val="center"/>
       </w:pPr>
+      <w:r/>
+      <w:r>
+        <w:drawing>
+          <wp:inline xmlns:a="http://schemas.openxmlformats.org/drawingml/2006/main" xmlns:pic="http://schemas.openxmlformats.org/drawingml/2006/picture">
+            <wp:extent cx="5029200" cy="5897801"/>
+            <wp:docPr id="10" name="Picture 10"/>
+            <wp:cNvGraphicFramePr>
+              <a:graphicFrameLocks noChangeAspect="1"/>
+            </wp:cNvGraphicFramePr>
+            <a:graphic>
+              <a:graphicData uri="http://schemas.openxmlformats.org/drawingml/2006/picture">
+                <pic:pic>
+                  <pic:nvPicPr>
+                    <pic:cNvPr id="0" name="diagram architecture.png"/>
+                    <pic:cNvPicPr/>
+                  </pic:nvPicPr>
+                  <pic:blipFill>
+                    <a:blip r:embed="rId18"/>
+                    <a:stretch>
+                      <a:fillRect/>
+                    </a:stretch>
+                  </pic:blipFill>
+                  <pic:spPr>
+                    <a:xfrm>
+                      <a:off x="0" y="0"/>
+                      <a:ext cx="5029200" cy="5897801"/>
+                    </a:xfrm>
+                    <a:prstGeom prst="rect"/>
+                  </pic:spPr>
+                </pic:pic>
+              </a:graphicData>
+            </a:graphic>
+          </wp:inline>
+        </w:drawing>
+      </w:r>
+    </w:p>
+    <w:p>
+      <w:pPr>
+        <w:jc w:val="center"/>
+      </w:pPr>
       <w:r>
         <w:rPr>
-          <w:rFonts w:ascii="Consolas" w:hAnsi="Consolas"/>
-          <w:b/>
-          <w:sz w:val="19"/>
+          <w:rFonts w:ascii="Calibri" w:hAnsi="Calibri"/>
+          <w:i/>
+          <w:color w:val="64748B"/>
+          <w:sz w:val="20"/>
         </w:rPr>
-        <w:t>┌─────────────────────────────────────────────────────────────┐</w:t>
-        <w:br/>
-        <w:t>│                      FRONTEND LAYER                         │</w:t>
-        <w:br/>
-        <w:t>│             Next.js Client (SPA &amp; Mobile‑First)             │</w:t>
-        <w:br/>
-        <w:t>└──────────────────────────────┬──────────────────────────────┘</w:t>
-        <w:br/>
-        <w:t xml:space="preserve">                               │ HTTP Requests / WebSockets</w:t>
-        <w:br/>
-        <w:t xml:space="preserve">                               ▼</w:t>
-        <w:br/>
-        <w:t>┌─────────────────────────────────────────────────────────────┐</w:t>
-        <w:br/>
-        <w:t>│                      BACKEND API LAYER                      │</w:t>
-        <w:br/>
-        <w:t>│             Express.js Server (REST &amp; Socket.IO)            │</w:t>
-        <w:br/>
-        <w:t>└──────────────┬───────────────────────────────┬──────────────┘</w:t>
-        <w:br/>
-        <w:t xml:space="preserve">               │                               │</w:t>
-        <w:br/>
-        <w:t xml:space="preserve">               │ Prisma ORM                    │ HTTPS Multi‑part</w:t>
-        <w:br/>
-        <w:t xml:space="preserve">               ▼                               ▼</w:t>
-        <w:br/>
-        <w:t>┌──────────────────────────────┐ ┌────────────────────────────┐</w:t>
-        <w:br/>
-        <w:t>│        DATABASE LAYER        │ │       IMAGE STORAGE        │</w:t>
-        <w:br/>
-        <w:t>│    Supabase (PostgreSQL)     │ │     Cloudinary Storage     │</w:t>
-        <w:br/>
-        <w:t>│    [PostGIS Spasial Aktif]   │ │   [Simpan Gambar Fisik]    │</w:t>
-        <w:br/>
-        <w:t>└──────────────────────────────┘ └────────────────────────────┘</w:t>
+        <w:t>Gambar 3.0: Arsitektur Sistem Rongsok.in</w:t>
       </w:r>
     </w:p>
     <w:p>
       <w:r>
-        <w:t>Aliran data pada arsitektur sistem di atas berjalan sebagai berikut:</w:t>
+        <w:t>Aliran data pada arsitektur sistem di atas berjalan secara terstruktur sebagai berikut:</w:t>
         <w:br/>
-        <w:t>1. Pengguna berinteraksi langsung dengan antarmuka Next.js yang teroptimasi secara mobile-first.</w:t>
+        <w:t>1. Akses Antarmuka Klien: Pengguna mengakses antarmuka Next.js yang di-host di Vercel. Klien dirancang responsif (mobile-first) dan melakukan rendering dinamis (Server-Side Rendering / SSR) untuk optimalisasi performa.</w:t>
         <w:br/>
-        <w:t>2. Next.js melakukan komunikasi asinkron dengan REST API Express.js melalui pengiriman token JWT di dalam authorization header. Koneksi Socket.IO dipertahankan untuk lalu intratif real-time.</w:t>
+        <w:t>2. Gerbang Infrastruktur Aman: Seluruh lalu lintas HTTP/HTTPS dan WebSockets dari klien menuju server backend dijembatani secara aman oleh Cloudflare Tunnel. Solusi ini mengenkripsi saluran komunikasi secara end-to-end dan menyembunyikan alamat IP asli server backend dari ancaman publik tanpa memerlukan pembukaan port firewall lokal.</w:t>
         <w:br/>
-        <w:t>3. File gambar biner diunggah langsung dari frontend Next.js ke Cloudinary Storage (Client-side upload) untuk meringankan beban server API. Cloudinary mengembalikan URL gambar statis.</w:t>
+        <w:t>3. Komunikasi REST API &amp; Real-time: Next.js melakukan komunikasi asinkron dengan REST API Express.js dengan menyematkan token stateless JWT pada Authorization Header. Koneksi Socket.IO interaktif tetap dipertahankan secara persisten untuk penanganan siaran (broadcast) pesanan baru secara real-time.</w:t>
         <w:br/>
-        <w:t>4. Express.js memproses logika bisnis dan melakukan query database secara terstruktur menggunakan Prisma ORM. Query spasial geolocation dieksekusi menggunakan modul $queryRaw PostgreSQL untuk memanggil fungsi-fungsi PostGIS.</w:t>
+        <w:t>4. Manajemen Kontainer Server: Server Express.js berjalan secara terisolasi di dalam kontainer Docker yang dikelola oleh klaster orchestration Docker Swarm di bawah kendali CapRover PaaS. Infrastruktur ini berjalan di atas sistem operasi Pop!_OS 24.04 LTS (Home Lab Server) yang menjamin ketersediaan tinggi (high availability) dan pemulihan mandiri jika kontainer bermasalah.</w:t>
+        <w:br/>
+        <w:t>5. Penyimpanan Berkas Media: Berkas gambar biner seperti foto sampah, avatar profil, dan bukti transaksi diunggah secara asinkron dari Next.js langsung ke Cloudinary Storage (Client-side upload) menggunakan Secure Signature SDK, meminimalisasi beban bandwidth dan memori pada server Express.js. Cloudinary mengembalikan URL CDN statis teroptimasi.</w:t>
+        <w:br/>
+        <w:t>6. Akses Data Terstruktur &amp; Spasial: Express.js memproses logika bisnis dan berinteraksi dengan database relasional Supabase PostgreSQL melalui Prisma ORM. Khusus untuk operasi penemuan spasial (spatial discovery) berdasarkan koordinat lokasi GPS (lintang dan bujur), sistem memanfaatkan kueri SQL mentah ($queryRaw) untuk mengeksekusi fungsi geospasial PostGIS seperti ST_DWithin dan ST_Distance dengan dukungan indeks spasial GIST.</w:t>
       </w:r>
     </w:p>
     <w:p>
@@ -487,14 +498,15 @@
         <w:spacing w:after="120"/>
         <w:jc w:val="left"/>
       </w:pPr>
+      <w:r/>
       <w:r>
         <w:rPr>
           <w:rFonts w:ascii="Calibri" w:hAnsi="Calibri"/>
           <w:b/>
-          <w:i w:val="0"/>
+          <w:color w:val="374151"/>
           <w:sz w:val="24"/>
         </w:rPr>
-        <w:t>1. Diagram Use Case - Peran Customer (Penghasil Sampah)</w:t>
+        <w:t>Use Case Customer</w:t>
       </w:r>
     </w:p>
     <w:p>
@@ -554,8 +566,7 @@
     </w:p>
     <w:p>
       <w:pPr>
-        <w:spacing w:after="120"/>
-        <w:ind w:left="360"/>
+        <w:pStyle w:val="ListBullet"/>
       </w:pPr>
       <w:r>
         <w:rPr>
@@ -563,20 +574,32 @@
           <w:b/>
           <w:sz w:val="22"/>
         </w:rPr>
-        <w:t xml:space="preserve">UC-01: Registrasi Akun (Customer): </w:t>
+        <w:t>Manajemen Akun Customer</w:t>
+      </w:r>
+    </w:p>
+    <w:p>
+      <w:pPr>
+        <w:pStyle w:val="ListBullet2"/>
+      </w:pPr>
+      <w:r>
+        <w:rPr>
+          <w:rFonts w:ascii="Calibri" w:hAnsi="Calibri"/>
+          <w:i/>
+          <w:sz w:val="22"/>
+        </w:rPr>
+        <w:t xml:space="preserve">Use case </w:t>
       </w:r>
       <w:r>
         <w:rPr>
           <w:rFonts w:ascii="Calibri" w:hAnsi="Calibri"/>
           <w:sz w:val="22"/>
         </w:rPr>
-        <w:t>Proses registrasi akun baru merupakan langkah awal bagi pengguna publik untuk mendaftarkan diri ke platform Rongsok.in dengan memasukkan nama, alamat email aktif, nomor telepon WhatsApp, dan kata sandi yang aman. Sistem memaksa pengguna memilih peran secara permanen sebagai 'Customer' guna mengunci tampilan antarmuka pencarian sampah daur ulang sejak pertama kali masuk.</w:t>
+        <w:t>ini merupakan gerbang utama bagi pengguna baru maupun lama untuk mengelola identitas digital mereka di dalam platform. Melalui fungsionalitas ini, sistem memastikan bahwa setiap aktivitas pengguna tercatat dengan aman dan terikat pada profil yang valid.</w:t>
       </w:r>
     </w:p>
     <w:p>
       <w:pPr>
-        <w:spacing w:after="120"/>
-        <w:ind w:left="360"/>
+        <w:pStyle w:val="ListBullet2"/>
       </w:pPr>
       <w:r>
         <w:rPr>
@@ -584,20 +607,19 @@
           <w:b/>
           <w:sz w:val="22"/>
         </w:rPr>
-        <w:t xml:space="preserve">UC-02: Pilih Peran (Customer/Pengepul): </w:t>
+        <w:t xml:space="preserve">Registrasi &amp; Login JWT: </w:t>
       </w:r>
       <w:r>
         <w:rPr>
           <w:rFonts w:ascii="Calibri" w:hAnsi="Calibri"/>
           <w:sz w:val="22"/>
         </w:rPr>
-        <w:t>Fungsionalitas ini terintegrasi erat (&lt;&lt;include&gt;&gt;) dengan proses registrasi akun, di mana calon pengguna wajib menentukan perannya untuk memastikan hak akses data dan alur kerja aplikasi terkonfigurasi dengan benar di database.</w:t>
+        <w:t>Proses di mana calon pengguna mendaftarkan akun baru dan masuk ke dalam aplikasi menggunakan token berbasis JSON Web Token (JWT) untuk menjaga keamanan sesi tanpa harus berulang kali memasukkan kata sandi.</w:t>
       </w:r>
     </w:p>
     <w:p>
       <w:pPr>
-        <w:spacing w:after="120"/>
-        <w:ind w:left="360"/>
+        <w:pStyle w:val="ListBullet2"/>
       </w:pPr>
       <w:r>
         <w:rPr>
@@ -605,20 +627,19 @@
           <w:b/>
           <w:sz w:val="22"/>
         </w:rPr>
-        <w:t xml:space="preserve">UC-03: Login &amp; Sesi JWT: </w:t>
+        <w:t xml:space="preserve">Kelola Profil &amp; Alamat: </w:t>
       </w:r>
       <w:r>
         <w:rPr>
           <w:rFonts w:ascii="Calibri" w:hAnsi="Calibri"/>
           <w:sz w:val="22"/>
         </w:rPr>
-        <w:t>Sistem autentikasi menggunakan email dan kata sandi yang telah terdaftar untuk menerbitkan JSON Web Token (JWT) yang disimpan di HTTP-only cookie. Protokol ini menjamin perlindungan privasi data pengguna dan memungkinkan komunikasi stateless yang aman dengan backend API.</w:t>
+        <w:t>Memungkinkan pengguna untuk memperbarui data diri, mengubah foto profil (avatar), serta menyimpan titik koordinat rumah atau alamat utama guna mempermudah proses penjemputan sampah nantinya.</w:t>
       </w:r>
     </w:p>
     <w:p>
       <w:pPr>
-        <w:spacing w:after="120"/>
-        <w:ind w:left="360"/>
+        <w:pStyle w:val="ListBullet"/>
       </w:pPr>
       <w:r>
         <w:rPr>
@@ -626,20 +647,32 @@
           <w:b/>
           <w:sz w:val="22"/>
         </w:rPr>
-        <w:t xml:space="preserve">UC-04: Kelola Profil &amp; Avatar: </w:t>
+        <w:t>Mencari Pengepul</w:t>
+      </w:r>
+    </w:p>
+    <w:p>
+      <w:pPr>
+        <w:pStyle w:val="ListBullet2"/>
+      </w:pPr>
+      <w:r>
+        <w:rPr>
+          <w:rFonts w:ascii="Calibri" w:hAnsi="Calibri"/>
+          <w:i/>
+          <w:sz w:val="22"/>
+        </w:rPr>
+        <w:t xml:space="preserve">Use case </w:t>
       </w:r>
       <w:r>
         <w:rPr>
           <w:rFonts w:ascii="Calibri" w:hAnsi="Calibri"/>
           <w:sz w:val="22"/>
         </w:rPr>
-        <w:t>Customer dapat mengedit data personal mereka seperti mengubah nama tampilan, memperbarui nomor WhatsApp yang aktif untuk koordinasi transaksi, serta mengganti foto avatar profil yang disimpan secara terpusat pada media penyimpanan Cloudinary.</w:t>
+        <w:t>ini berfungsi untuk menjembatani pengguna dengan mitra pengepul terdekat yang sesuai dengan kebutuhan mereka. Sistem akan menyaring informasi secara dinamis agar pengguna mendapatkan pilihan lapak terbaik di sekitar lokasi mereka.</w:t>
       </w:r>
     </w:p>
     <w:p>
       <w:pPr>
-        <w:spacing w:after="120"/>
-        <w:ind w:left="360"/>
+        <w:pStyle w:val="ListBullet2"/>
       </w:pPr>
       <w:r>
         <w:rPr>
@@ -647,20 +680,19 @@
           <w:b/>
           <w:sz w:val="22"/>
         </w:rPr>
-        <w:t xml:space="preserve">UC-06: Deteksi Lokasi Spasial (GPS): </w:t>
+        <w:t xml:space="preserve">Deteksi Lokasi GPS: </w:t>
       </w:r>
       <w:r>
         <w:rPr>
           <w:rFonts w:ascii="Calibri" w:hAnsi="Calibri"/>
           <w:sz w:val="22"/>
         </w:rPr>
-        <w:t>Use case ini memanfaatkan HTML5 Geolocation API di peramban guna mendeteksi koordinat garis lintang (latitude) dan bujur (longitude) dari perangkat pengguna secara presisi. Koordinat ini menjadi dasar penting bagi penentuan titik jemput maupun perhitungan jarak terdekat ke pengepul.</w:t>
+        <w:t>Mengaktifkan fitur pelacakan koordinat spasial pada perangkat pengguna secara *real-time* untuk menentukan titik asal pencarian lapak pengepul terdekat.</w:t>
       </w:r>
     </w:p>
     <w:p>
       <w:pPr>
-        <w:spacing w:after="120"/>
-        <w:ind w:left="360"/>
+        <w:pStyle w:val="ListBullet2"/>
       </w:pPr>
       <w:r>
         <w:rPr>
@@ -668,20 +700,19 @@
           <w:b/>
           <w:sz w:val="22"/>
         </w:rPr>
-        <w:t xml:space="preserve">UC-07: Cari Pengepul Terdekat (Radius Spasial PostGIS): </w:t>
+        <w:t xml:space="preserve">Filter Kategori Sampah: </w:t>
       </w:r>
       <w:r>
         <w:rPr>
           <w:rFonts w:ascii="Calibri" w:hAnsi="Calibri"/>
           <w:sz w:val="22"/>
         </w:rPr>
-        <w:t>Customer dapat mencari pengepul aktif di sekitarnya menggunakan pencarian berbasis spasial. Backend memanfaatkan ekstensi PostGIS (tabel PostgreSQL) dengan fungsi ST_DWithin untuk menyaring pengepul dalam radius jangkauan operasional dan mengurutkannya dari yang terdekat.</w:t>
+        <w:t>Memberikan fleksibilitas bagi pengguna untuk menyaring daftar pengepul berdasarkan jenis sampah tertentu yang ingin mereka jual, seperti plastik, kertas, elektronik, atau logam.</w:t>
       </w:r>
     </w:p>
     <w:p>
       <w:pPr>
-        <w:spacing w:after="120"/>
-        <w:ind w:left="360"/>
+        <w:pStyle w:val="ListBullet2"/>
       </w:pPr>
       <w:r>
         <w:rPr>
@@ -689,20 +720,19 @@
           <w:b/>
           <w:sz w:val="22"/>
         </w:rPr>
-        <w:t xml:space="preserve">UC-08: Filter Kategori Sampah: </w:t>
+        <w:t xml:space="preserve">Lihat Detail Lapak &amp; Katalog: </w:t>
       </w:r>
       <w:r>
         <w:rPr>
           <w:rFonts w:ascii="Calibri" w:hAnsi="Calibri"/>
           <w:sz w:val="22"/>
         </w:rPr>
-        <w:t>Fungsionalitas penyaringan ini memperluas (&lt;&lt;extend&gt;&gt;) fitur pencarian utama, memungkinkan Customer untuk memilah daftar pengepul hanya yang bersedia membeli kategori sampah tertentu, seperti kardus bekas, botol plastik PET, kertas koran, atau logam besi.</w:t>
+        <w:t>Menyajikan informasi lengkap mengenai profil lapak yang dipilih, mulai dari jam operasional, foto lokasi, hingga daftar harga terkini dari setiap jenis komoditas sampah yang mereka terima.</w:t>
       </w:r>
     </w:p>
     <w:p>
       <w:pPr>
-        <w:spacing w:after="120"/>
-        <w:ind w:left="360"/>
+        <w:pStyle w:val="ListBullet"/>
       </w:pPr>
       <w:r>
         <w:rPr>
@@ -710,20 +740,32 @@
           <w:b/>
           <w:sz w:val="22"/>
         </w:rPr>
-        <w:t xml:space="preserve">UC-09: Lihat Detail &amp; Katalog Lapak: </w:t>
+        <w:t>Mengelola Pesanan</w:t>
+      </w:r>
+    </w:p>
+    <w:p>
+      <w:pPr>
+        <w:pStyle w:val="ListBullet2"/>
+      </w:pPr>
+      <w:r>
+        <w:rPr>
+          <w:rFonts w:ascii="Calibri" w:hAnsi="Calibri"/>
+          <w:i/>
+          <w:sz w:val="22"/>
+        </w:rPr>
+        <w:t xml:space="preserve">Use case </w:t>
       </w:r>
       <w:r>
         <w:rPr>
           <w:rFonts w:ascii="Calibri" w:hAnsi="Calibri"/>
           <w:sz w:val="22"/>
         </w:rPr>
-        <w:t>Sebelum mengajukan pesanan, Customer dapat meninjau profil lengkap pengepul pilihan mereka yang memuat informasi jam operasional, rating reputasi dari transaksi sebelumnya, deskripsi fasilitas, serta daftar katalog harga beli (Min-Max) per kilogram untuk tiap jenis sampah.</w:t>
+        <w:t>ini mengatur siklus hidup transaksi penjualan sampah, mulai dari inisiasi pemesanan hingga kesepakatan akhir di lapangan. Seluruh alur kerja dirancang untuk memberikan transparansi kuantitas dan harga antara kedua belah pihak.</w:t>
       </w:r>
     </w:p>
     <w:p>
       <w:pPr>
-        <w:spacing w:after="120"/>
-        <w:ind w:left="360"/>
+        <w:pStyle w:val="ListBullet2"/>
       </w:pPr>
       <w:r>
         <w:rPr>
@@ -731,20 +773,19 @@
           <w:b/>
           <w:sz w:val="22"/>
         </w:rPr>
-        <w:t xml:space="preserve">UC-10: Visualisasi Lapak pada Peta (Leaflet.js): </w:t>
+        <w:t xml:space="preserve">Buat Order Baru: </w:t>
       </w:r>
       <w:r>
         <w:rPr>
           <w:rFonts w:ascii="Calibri" w:hAnsi="Calibri"/>
           <w:sz w:val="22"/>
         </w:rPr>
-        <w:t>Use case ini memperluas (&lt;&lt;extend&gt;&gt;) visualisasi hasil pencarian dengan menampilkan titik-titik lokasi lapak pengepul secara interaktif menggunakan Leaflet.js dengan peta dasar dari OpenStreetMap, sehingga memudahkan Customer memahami posisi spasial para pengepul di sekitarnya.</w:t>
+        <w:t>Proses awal di mana pengguna membuat pesanan transaksi dengan menentukan metode penyerahan sampah yang diinginkan.</w:t>
       </w:r>
     </w:p>
     <w:p>
       <w:pPr>
-        <w:spacing w:after="120"/>
-        <w:ind w:left="360"/>
+        <w:pStyle w:val="ListBullet2"/>
       </w:pPr>
       <w:r>
         <w:rPr>
@@ -752,20 +793,19 @@
           <w:b/>
           <w:sz w:val="22"/>
         </w:rPr>
-        <w:t xml:space="preserve">UC-13: Buat Pesanan (Jemput / Antar): </w:t>
+        <w:t xml:space="preserve">Pilih Metode Pickup/Dropoff: </w:t>
       </w:r>
       <w:r>
         <w:rPr>
           <w:rFonts w:ascii="Calibri" w:hAnsi="Calibri"/>
           <w:sz w:val="22"/>
         </w:rPr>
-        <w:t>Customer dapat membuat permintaan transaksi dengan mengisi formulir pemesanan, memilih apakah sampah ingin dijemput oleh pengepul ke alamat kos/rumah (pick-up) atau diantarkan langsung secara mandiri ke lapak tujuan (drop-off).</w:t>
+        <w:t>Sub-proses di mana pengguna memilih apakah sampah akan dijemput oleh pihak pengepul (*pickup*) atau diantar langsung oleh pengguna ke lokasi lapak (*dropoff*).</w:t>
       </w:r>
     </w:p>
     <w:p>
       <w:pPr>
-        <w:spacing w:after="120"/>
-        <w:ind w:left="360"/>
+        <w:pStyle w:val="ListBullet2"/>
       </w:pPr>
       <w:r>
         <w:rPr>
@@ -773,20 +813,19 @@
           <w:b/>
           <w:sz w:val="22"/>
         </w:rPr>
-        <w:t xml:space="preserve">UC-14: Unggah Foto Sampah &amp; Estimasi Berat: </w:t>
+        <w:t xml:space="preserve">Unggah Foto Sampah: </w:t>
       </w:r>
       <w:r>
         <w:rPr>
           <w:rFonts w:ascii="Calibri" w:hAnsi="Calibri"/>
           <w:sz w:val="22"/>
         </w:rPr>
-        <w:t>Use case ini merupakan bagian wajib (&lt;&lt;include&gt;&gt;) saat pembuatan pesanan, di mana Customer harus mengunggah foto kondisi fisik tumpukan sampah daur ulang mereka ke Cloudinary serta menginput estimasi berat (dalam kilogram) sebagai referensi awal bagi pengepul.</w:t>
+        <w:t>Mewajibkan pengguna mengunggah foto tumpukan sampah beserta estimasi berat kasarnya agar pengepul mendapatkan gambaran awal sebelum memproses pesanan.</w:t>
       </w:r>
     </w:p>
     <w:p>
       <w:pPr>
-        <w:spacing w:after="120"/>
-        <w:ind w:left="360"/>
+        <w:pStyle w:val="ListBullet2"/>
       </w:pPr>
       <w:r>
         <w:rPr>
@@ -794,20 +833,19 @@
           <w:b/>
           <w:sz w:val="22"/>
         </w:rPr>
-        <w:t xml:space="preserve">UC-18: Negosiasi / Koreksi Harga: </w:t>
+        <w:t xml:space="preserve">Negosiasi &amp; Koreksi Harga: </w:t>
       </w:r>
       <w:r>
         <w:rPr>
           <w:rFonts w:ascii="Calibri" w:hAnsi="Calibri"/>
           <w:sz w:val="22"/>
         </w:rPr>
-        <w:t>Ketika pengepul telah selesai menimbang sampah di lokasi dan mengajukan harga final, Customer dapat menggunakan fitur ini jika merasa nominal tersebut kurang sesuai untuk bernegosiasi secara manual atau meminta pengepul mengoreksi timbangan sebelum transaksi ditutup.</w:t>
+        <w:t>Ruang diskusi digital atau mekanisme penyesuaian jika terjadi perbedaan taksiran harga awal atau penawaran khusus sebelum timbangan akhir dilakukan.</w:t>
       </w:r>
     </w:p>
     <w:p>
       <w:pPr>
-        <w:spacing w:after="120"/>
-        <w:ind w:left="360"/>
+        <w:pStyle w:val="ListBullet2"/>
       </w:pPr>
       <w:r>
         <w:rPr>
@@ -815,20 +853,19 @@
           <w:b/>
           <w:sz w:val="22"/>
         </w:rPr>
-        <w:t xml:space="preserve">UC-19: Konfirmasi Pesanan Selesai: </w:t>
+        <w:t xml:space="preserve">Konfirmasi Selesai Transaksi: </w:t>
       </w:r>
       <w:r>
         <w:rPr>
           <w:rFonts w:ascii="Calibri" w:hAnsi="Calibri"/>
           <w:sz w:val="22"/>
         </w:rPr>
-        <w:t>Use case ini merupakan tanda kesepakatan akhir di mana Customer mengklik tombol 'Setuju' atas berat aktual dan nominal harga yang diajukan pengepul, yang secara otomatis mengubah status transaksi menjadi COMPLETED dan mengunci data keuangan.</w:t>
+        <w:t>Tahap penutupan di mana pengguna memberikan persetujuan formal bahwa sampah telah diserahkan dan pembayaran telah diterima dengan sesuai.</w:t>
       </w:r>
     </w:p>
     <w:p>
       <w:pPr>
-        <w:spacing w:after="120"/>
-        <w:ind w:left="360"/>
+        <w:pStyle w:val="ListBullet"/>
       </w:pPr>
       <w:r>
         <w:rPr>
@@ -836,20 +873,32 @@
           <w:b/>
           <w:sz w:val="22"/>
         </w:rPr>
-        <w:t xml:space="preserve">UC-20: Akses Struk Digital &amp; Riwayat Transaksi: </w:t>
+        <w:t>Riwayat &amp; Ulasan</w:t>
+      </w:r>
+    </w:p>
+    <w:p>
+      <w:pPr>
+        <w:pStyle w:val="ListBullet2"/>
+      </w:pPr>
+      <w:r>
+        <w:rPr>
+          <w:rFonts w:ascii="Calibri" w:hAnsi="Calibri"/>
+          <w:i/>
+          <w:sz w:val="22"/>
+        </w:rPr>
+        <w:t xml:space="preserve">Use case </w:t>
       </w:r>
       <w:r>
         <w:rPr>
           <w:rFonts w:ascii="Calibri" w:hAnsi="Calibri"/>
           <w:sz w:val="22"/>
         </w:rPr>
-        <w:t>Setelah transaksi sukses dinyatakan selesai (&lt;&lt;include&gt;&gt;), sistem secara otomatis menerbitkan struk digital (digital receipt) berisi rekapitulasi data final transaksi (tanggal, ID, detail kategori sampah, berat timbangan, total uang) yang dapat diakses kembali kapan pun lewat menu riwayat.</w:t>
+        <w:t>ini digunakan sebagai sarana dokumentasi transaksi masa lalu serta ruang bagi pengguna untuk memberikan umpan balik demi menjaga kualitas ekosistem platform.</w:t>
       </w:r>
     </w:p>
     <w:p>
       <w:pPr>
-        <w:spacing w:after="120"/>
-        <w:ind w:left="360"/>
+        <w:pStyle w:val="ListBullet2"/>
       </w:pPr>
       <w:r>
         <w:rPr>
@@ -857,14 +906,54 @@
           <w:b/>
           <w:sz w:val="22"/>
         </w:rPr>
-        <w:t xml:space="preserve">UC-21: Berikan Rating &amp; Foto Ulasan ke Pengepul: </w:t>
+        <w:t xml:space="preserve">Lihat Struk Digital: </w:t>
       </w:r>
       <w:r>
         <w:rPr>
           <w:rFonts w:ascii="Calibri" w:hAnsi="Calibri"/>
           <w:sz w:val="22"/>
         </w:rPr>
-        <w:t>Fitur umpan balik ini memperluas (&lt;&lt;extend&gt;&gt;) proses penyelesaian pesanan, memberikan hak kepada Customer untuk menilai kinerja pengepul (kejujuran timbangan, keramahan, dan ketepatan waktu) berupa skor bintang 1-5 dan ulasan tekstual serta foto.</w:t>
+        <w:t>Memungkinkan pengguna untuk membuka kembali nota digital yang berisi rincian berat aktual, harga per kilogram, total uang yang diterima, dan tanggal transaksi.</w:t>
+      </w:r>
+    </w:p>
+    <w:p>
+      <w:pPr>
+        <w:pStyle w:val="ListBullet2"/>
+      </w:pPr>
+      <w:r>
+        <w:rPr>
+          <w:rFonts w:ascii="Calibri" w:hAnsi="Calibri"/>
+          <w:b/>
+          <w:sz w:val="22"/>
+        </w:rPr>
+        <w:t xml:space="preserve">Berikan Rating &amp; Review Pengepul: </w:t>
+      </w:r>
+      <w:r>
+        <w:rPr>
+          <w:rFonts w:ascii="Calibri" w:hAnsi="Calibri"/>
+          <w:sz w:val="22"/>
+        </w:rPr>
+        <w:t>Fasilitas bagi pengguna untuk memberikan penilaian bintang dan ulasan tekstual mengenai tingkat kepuasan layanan, keramahan, dan akurasi timbangan pengepul.</w:t>
+      </w:r>
+    </w:p>
+    <w:p>
+      <w:pPr>
+        <w:pStyle w:val="ListBullet2"/>
+      </w:pPr>
+      <w:r>
+        <w:rPr>
+          <w:rFonts w:ascii="Calibri" w:hAnsi="Calibri"/>
+          <w:b/>
+          <w:sz w:val="22"/>
+        </w:rPr>
+        <w:t xml:space="preserve">Unggah Foto Ulasan: </w:t>
+      </w:r>
+      <w:r>
+        <w:rPr>
+          <w:rFonts w:ascii="Calibri" w:hAnsi="Calibri"/>
+          <w:sz w:val="22"/>
+        </w:rPr>
+        <w:t>Fitur pendukung ulasan di mana pengguna bisa melampirkan foto bukti fisik struk kertas manual atau kondisi pelayanan di lapak sebagai validasi tambahan.</w:t>
       </w:r>
     </w:p>
     <w:p>
@@ -886,14 +975,15 @@
         <w:spacing w:after="120"/>
         <w:jc w:val="left"/>
       </w:pPr>
+      <w:r/>
       <w:r>
         <w:rPr>
           <w:rFonts w:ascii="Calibri" w:hAnsi="Calibri"/>
           <w:b/>
-          <w:i w:val="0"/>
+          <w:color w:val="374151"/>
           <w:sz w:val="24"/>
         </w:rPr>
-        <w:t>2. Diagram Use Case - Peran Pengepul (Lapak / Gudang)</w:t>
+        <w:t>Use Case Pengepul</w:t>
       </w:r>
     </w:p>
     <w:p>
@@ -953,8 +1043,7 @@
     </w:p>
     <w:p>
       <w:pPr>
-        <w:spacing w:after="120"/>
-        <w:ind w:left="360"/>
+        <w:pStyle w:val="ListBullet"/>
       </w:pPr>
       <w:r>
         <w:rPr>
@@ -962,20 +1051,32 @@
           <w:b/>
           <w:sz w:val="22"/>
         </w:rPr>
-        <w:t xml:space="preserve">UC-01: Registrasi Akun (Pengepul): </w:t>
+        <w:t>Manajemen Akun &amp; Lapak</w:t>
+      </w:r>
+    </w:p>
+    <w:p>
+      <w:pPr>
+        <w:pStyle w:val="ListBullet2"/>
+      </w:pPr>
+      <w:r>
+        <w:rPr>
+          <w:rFonts w:ascii="Calibri" w:hAnsi="Calibri"/>
+          <w:i/>
+          <w:sz w:val="22"/>
+        </w:rPr>
+        <w:t xml:space="preserve">Use case </w:t>
       </w:r>
       <w:r>
         <w:rPr>
           <w:rFonts w:ascii="Calibri" w:hAnsi="Calibri"/>
           <w:sz w:val="22"/>
         </w:rPr>
-        <w:t>Mekanisme pendaftaran akun khusus bagi mitra pengepul daur ulang dengan melampirkan informasi dasar akun. Setelah registrasi awal berhasil, sistem akan mengidentifikasi peran sebagai Pengepul dan langsung mengarahkannya untuk melengkapi profil lapak fisik sebelum bisa aktif menerima pesanan.</w:t>
+        <w:t>ini memfasilitasi para pemilik lapak atau gudang rongsok untuk melegalisasi dan menampilkan eksistensi bisnis mereka di dalam aplikasi agar dapat ditemukan oleh calon pelanggan.</w:t>
       </w:r>
     </w:p>
     <w:p>
       <w:pPr>
-        <w:spacing w:after="120"/>
-        <w:ind w:left="360"/>
+        <w:pStyle w:val="ListBullet2"/>
       </w:pPr>
       <w:r>
         <w:rPr>
@@ -983,20 +1084,19 @@
           <w:b/>
           <w:sz w:val="22"/>
         </w:rPr>
-        <w:t xml:space="preserve">UC-03: Login &amp; Sesi JWT: </w:t>
+        <w:t xml:space="preserve">Registrasi &amp; Login Akun: </w:t>
       </w:r>
       <w:r>
         <w:rPr>
           <w:rFonts w:ascii="Calibri" w:hAnsi="Calibri"/>
           <w:sz w:val="22"/>
         </w:rPr>
-        <w:t>Sistem memverifikasi kredensial email dan kata sandi pengepul, lalu menerbitkan JWT aman sebagai token otorisasi berumur terbatas agar pengepul dapat berinteraksi dengan API tertutup Rongsok.in.</w:t>
+        <w:t>Proses pendaftaran dan autentikasi khusus bagi pelaku usaha pengepulan untuk masuk ke dasbor operasional mereka.</w:t>
       </w:r>
     </w:p>
     <w:p>
       <w:pPr>
-        <w:spacing w:after="120"/>
-        <w:ind w:left="360"/>
+        <w:pStyle w:val="ListBullet2"/>
       </w:pPr>
       <w:r>
         <w:rPr>
@@ -1004,20 +1104,19 @@
           <w:b/>
           <w:sz w:val="22"/>
         </w:rPr>
-        <w:t xml:space="preserve">UC-04: Kelola Profil &amp; Avatar: </w:t>
+        <w:t xml:space="preserve">Lengkapi Profil &amp; Foto Lapak: </w:t>
       </w:r>
       <w:r>
         <w:rPr>
           <w:rFonts w:ascii="Calibri" w:hAnsi="Calibri"/>
           <w:sz w:val="22"/>
         </w:rPr>
-        <w:t>Pengepul dapat memperbarui profil personal mereka seperti foto profil, nama lengkap, serta kontak telepon operasional yang terhubung langsung ke WhatsApp sebagai jalur komunikasi eksternal utama dengan Customer.</w:t>
+        <w:t>Proses verifikasi tempat usaha dengan mengunggah foto fisik lapak, spanduk, atau gudang, serta mengatur deskripsi usaha agar menarik kepercayaan *customer*.</w:t>
       </w:r>
     </w:p>
     <w:p>
       <w:pPr>
-        <w:spacing w:after="120"/>
-        <w:ind w:left="360"/>
+        <w:pStyle w:val="ListBullet"/>
       </w:pPr>
       <w:r>
         <w:rPr>
@@ -1025,20 +1124,32 @@
           <w:b/>
           <w:sz w:val="22"/>
         </w:rPr>
-        <w:t xml:space="preserve">UC-05: Lengkapi Profil &amp; Foto Lapak: </w:t>
+        <w:t>Manajemen Katalog</w:t>
+      </w:r>
+    </w:p>
+    <w:p>
+      <w:pPr>
+        <w:pStyle w:val="ListBullet2"/>
+      </w:pPr>
+      <w:r>
+        <w:rPr>
+          <w:rFonts w:ascii="Calibri" w:hAnsi="Calibri"/>
+          <w:i/>
+          <w:sz w:val="22"/>
+        </w:rPr>
+        <w:t xml:space="preserve">Use case </w:t>
       </w:r>
       <w:r>
         <w:rPr>
           <w:rFonts w:ascii="Calibri" w:hAnsi="Calibri"/>
           <w:sz w:val="22"/>
         </w:rPr>
-        <w:t>Fitur wajib pasca-registrasi (&lt;&lt;extend&gt;&gt;) yang memungkinkan Pengepul mengisi data lapak fisik mencakup nama lapak/gudang, radius layanan operasional (dalam km), mengunggah foto gudang, serta mengaktifkan status buka/tutup lapak di peta digital.</w:t>
+        <w:t>ini memberikan kendali penuh kepada pengepul untuk mengatur strategi bisnis internal mereka, terutama terkait komoditas yang diperjualbelikan.</w:t>
       </w:r>
     </w:p>
     <w:p>
       <w:pPr>
-        <w:spacing w:after="120"/>
-        <w:ind w:left="360"/>
+        <w:pStyle w:val="ListBullet2"/>
       </w:pPr>
       <w:r>
         <w:rPr>
@@ -1046,20 +1157,19 @@
           <w:b/>
           <w:sz w:val="22"/>
         </w:rPr>
-        <w:t xml:space="preserve">UC-11: Atur Katalog Harga &amp; Kategori Sampah: </w:t>
+        <w:t xml:space="preserve">Atur Katalog Harga &amp; Kategori: </w:t>
       </w:r>
       <w:r>
         <w:rPr>
           <w:rFonts w:ascii="Calibri" w:hAnsi="Calibri"/>
           <w:sz w:val="22"/>
         </w:rPr>
-        <w:t>Pengepul memiliki kendali penuh untuk mengelola daftar kategori sampah yang mereka terima berdasarkan data master. Pengepul dapat menyetel rentang harga beli minimum dan maksimum per kilogram untuk menjaga transparansi nilai tawar kepada calon Customer.</w:t>
+        <w:t>Memungkinkan pengepul untuk memperbarui harga beli sampah secara berkala mengikuti fluktuasi harga pasar rongsokan, serta mengaktifkan atau nonaktifkan jenis sampah yang sedang tidak mereka terima.</w:t>
       </w:r>
     </w:p>
     <w:p>
       <w:pPr>
-        <w:spacing w:after="120"/>
-        <w:ind w:left="360"/>
+        <w:pStyle w:val="ListBullet"/>
       </w:pPr>
       <w:r>
         <w:rPr>
@@ -1067,20 +1177,32 @@
           <w:b/>
           <w:sz w:val="22"/>
         </w:rPr>
-        <w:t xml:space="preserve">UC-15: Terima Notifikasi Pesanan Real-time (Socket.IO): </w:t>
+        <w:t>Proses Pesanan Masuk</w:t>
+      </w:r>
+    </w:p>
+    <w:p>
+      <w:pPr>
+        <w:pStyle w:val="ListBullet2"/>
+      </w:pPr>
+      <w:r>
+        <w:rPr>
+          <w:rFonts w:ascii="Calibri" w:hAnsi="Calibri"/>
+          <w:i/>
+          <w:sz w:val="22"/>
+        </w:rPr>
+        <w:t xml:space="preserve">Use case </w:t>
       </w:r>
       <w:r>
         <w:rPr>
           <w:rFonts w:ascii="Calibri" w:hAnsi="Calibri"/>
           <w:sz w:val="22"/>
         </w:rPr>
-        <w:t>Melalui koneksi Socket.IO yang terjalin terus-menerus, Pengepul akan mendapatkan alarm visual dan suara di layar smartphone secara real-time apabila ada pesanan Customer terdekat masuk dalam radius jangkauan lapak mereka.</w:t>
+        <w:t>ini merupakan inti dari aktivitas harian pengepul dalam merespons dan mengeksekusi setiap permintaan transaksi dari pengguna di sekitar wilayah operasional mereka.</w:t>
       </w:r>
     </w:p>
     <w:p>
       <w:pPr>
-        <w:spacing w:after="120"/>
-        <w:ind w:left="360"/>
+        <w:pStyle w:val="ListBullet2"/>
       </w:pPr>
       <w:r>
         <w:rPr>
@@ -1088,20 +1210,19 @@
           <w:b/>
           <w:sz w:val="22"/>
         </w:rPr>
-        <w:t xml:space="preserve">UC-16: Terima / Tolak Order: </w:t>
+        <w:t xml:space="preserve">Terima Notifikasi Real-time: </w:t>
       </w:r>
       <w:r>
         <w:rPr>
           <w:rFonts w:ascii="Calibri" w:hAnsi="Calibri"/>
           <w:sz w:val="22"/>
         </w:rPr>
-        <w:t>Pengepul memiliki waktu maksimal 15 menit untuk meninjau detail pesanan (foto sampah, alamat, estimasi berat) dan memutuskan untuk menerimanya (CONFIRMED) atau menolak pesanan tersebut agar dilempar ke pengepul lain sebelum otomatis dibatalkan sistem.</w:t>
+        <w:t>Sistem secara otomatis mengirimkan pemberitahuan instan ke perangkat pengepul begitu ada pengguna terdekat yang membuat pesanan transaksi baru.</w:t>
       </w:r>
     </w:p>
     <w:p>
       <w:pPr>
-        <w:spacing w:after="120"/>
-        <w:ind w:left="360"/>
+        <w:pStyle w:val="ListBullet2"/>
       </w:pPr>
       <w:r>
         <w:rPr>
@@ -1109,20 +1230,19 @@
           <w:b/>
           <w:sz w:val="22"/>
         </w:rPr>
-        <w:t xml:space="preserve">UC-17: Input Berat Aktual &amp; Bukti Foto Timbangan: </w:t>
+        <w:t xml:space="preserve">Terima / Tolak Order: </w:t>
       </w:r>
       <w:r>
         <w:rPr>
           <w:rFonts w:ascii="Calibri" w:hAnsi="Calibri"/>
           <w:sz w:val="22"/>
         </w:rPr>
-        <w:t>Setelah tiba di lokasi Customer dan melakukan pengukuran berat secara fisik, Pengepul wajib menginput angka timbangan aktual (kg) ke sistem serta mengunggah foto bukti timbangan nyata atau nota digital sebagai jaminan kejujuran transaksi.</w:t>
+        <w:t>Keputusan taktis pengepul untuk menyetujui pesanan berdasarkan ketersediaan armada penjemputan atau menolaknya jika kapasitas gudang sedang penuh atau jarak terlalu jauh.</w:t>
       </w:r>
     </w:p>
     <w:p>
       <w:pPr>
-        <w:spacing w:after="120"/>
-        <w:ind w:left="360"/>
+        <w:pStyle w:val="ListBullet2"/>
       </w:pPr>
       <w:r>
         <w:rPr>
@@ -1130,20 +1250,19 @@
           <w:b/>
           <w:sz w:val="22"/>
         </w:rPr>
-        <w:t xml:space="preserve">UC-20: Akses Struk Digital &amp; Riwayat Transaksi: </w:t>
+        <w:t xml:space="preserve">Input Berat &amp; Bukti Timbangan: </w:t>
       </w:r>
       <w:r>
         <w:rPr>
           <w:rFonts w:ascii="Calibri" w:hAnsi="Calibri"/>
           <w:sz w:val="22"/>
         </w:rPr>
-        <w:t>Sama seperti Customer, Pengepul dapat membuka arsip riwayat transaksi masa lalu mereka untuk memantau performa bisnis, total omzet, volume sampah yang dikumpulkan, serta mengunduh struk digital resmi yang diterbitkan oleh sistem.</w:t>
+        <w:t>Setelah fisik sampah diperiksa, pengepul memasukkan angka berat bersih yang sebenarnya ke aplikasi dan mengunggah foto angka di timbangan digital sebagai bukti otentik yang transparan.</w:t>
       </w:r>
     </w:p>
     <w:p>
       <w:pPr>
-        <w:spacing w:after="120"/>
-        <w:ind w:left="360"/>
+        <w:pStyle w:val="ListBullet"/>
       </w:pPr>
       <w:r>
         <w:rPr>
@@ -1151,14 +1270,67 @@
           <w:b/>
           <w:sz w:val="22"/>
         </w:rPr>
-        <w:t xml:space="preserve">UC-22: Berikan Rating Kualitas Sampah Customer: </w:t>
+        <w:t>Riwayat Transaksi Lapak</w:t>
+      </w:r>
+    </w:p>
+    <w:p>
+      <w:pPr>
+        <w:pStyle w:val="ListBullet2"/>
+      </w:pPr>
+      <w:r>
+        <w:rPr>
+          <w:rFonts w:ascii="Calibri" w:hAnsi="Calibri"/>
+          <w:i/>
+          <w:sz w:val="22"/>
+        </w:rPr>
+        <w:t xml:space="preserve">Use case </w:t>
       </w:r>
       <w:r>
         <w:rPr>
           <w:rFonts w:ascii="Calibri" w:hAnsi="Calibri"/>
           <w:sz w:val="22"/>
         </w:rPr>
-        <w:t>Guna membangun ekosistem yang sehat, Pengepul memiliki hak memperluas (&lt;&lt;extend&gt;&gt;) transaksi akhir dengan memberikan rating bintang 1-5 kepada Customer untuk menilai kebersihan sampah (tidak basah/berbau busuk) serta kesesuaian deskripsi awal.</w:t>
+        <w:t>ini berfungsi sebagai buku kas digital bagi pengepul untuk memantau performa bisnis dan rekam jejak interaksi dengan para pelanggan.</w:t>
+      </w:r>
+    </w:p>
+    <w:p>
+      <w:pPr>
+        <w:pStyle w:val="ListBullet2"/>
+      </w:pPr>
+      <w:r>
+        <w:rPr>
+          <w:rFonts w:ascii="Calibri" w:hAnsi="Calibri"/>
+          <w:b/>
+          <w:sz w:val="22"/>
+        </w:rPr>
+        <w:t xml:space="preserve">Lihat Struk Digital: </w:t>
+      </w:r>
+      <w:r>
+        <w:rPr>
+          <w:rFonts w:ascii="Calibri" w:hAnsi="Calibri"/>
+          <w:sz w:val="22"/>
+        </w:rPr>
+        <w:t>Mengakses arsip seluruh nota keluar untuk keperluan pembukuan keuangan bulanan lapak.</w:t>
+      </w:r>
+    </w:p>
+    <w:p>
+      <w:pPr>
+        <w:pStyle w:val="ListBullet2"/>
+      </w:pPr>
+      <w:r>
+        <w:rPr>
+          <w:rFonts w:ascii="Calibri" w:hAnsi="Calibri"/>
+          <w:b/>
+          <w:sz w:val="22"/>
+        </w:rPr>
+        <w:t xml:space="preserve">Berikan Rating Kualitas Sampah Customer: </w:t>
+      </w:r>
+      <w:r>
+        <w:rPr>
+          <w:rFonts w:ascii="Calibri" w:hAnsi="Calibri"/>
+          <w:sz w:val="22"/>
+        </w:rPr>
+        <w:t>Fitur bagi pengepul untuk memberikan penilaian terhadap kejujuran *customer* terkait kondisi sampah yang dijual (misalnya: apakah sampah sudah dipilah dengan bersih atau justru sengaja dibasahi agar lebih berat).</w:t>
       </w:r>
     </w:p>
     <w:p>
@@ -1180,14 +1352,15 @@
         <w:spacing w:after="120"/>
         <w:jc w:val="left"/>
       </w:pPr>
+      <w:r/>
       <w:r>
         <w:rPr>
           <w:rFonts w:ascii="Calibri" w:hAnsi="Calibri"/>
           <w:b/>
-          <w:i w:val="0"/>
+          <w:color w:val="374151"/>
           <w:sz w:val="24"/>
         </w:rPr>
-        <w:t>3. Diagram Use Case - Peran Admin (Tim Pengelola)</w:t>
+        <w:t>Use Case Admin</w:t>
       </w:r>
     </w:p>
     <w:p>
@@ -1247,8 +1420,7 @@
     </w:p>
     <w:p>
       <w:pPr>
-        <w:spacing w:after="120"/>
-        <w:ind w:left="360"/>
+        <w:pStyle w:val="ListBullet"/>
       </w:pPr>
       <w:r>
         <w:rPr>
@@ -1256,20 +1428,32 @@
           <w:b/>
           <w:sz w:val="22"/>
         </w:rPr>
-        <w:t xml:space="preserve">UC-03: Login &amp; Sesi JWT: </w:t>
+        <w:t>Autentikasi Admin</w:t>
+      </w:r>
+    </w:p>
+    <w:p>
+      <w:pPr>
+        <w:pStyle w:val="ListBullet2"/>
+      </w:pPr>
+      <w:r>
+        <w:rPr>
+          <w:rFonts w:ascii="Calibri" w:hAnsi="Calibri"/>
+          <w:i/>
+          <w:sz w:val="22"/>
+        </w:rPr>
+        <w:t xml:space="preserve">Use case </w:t>
       </w:r>
       <w:r>
         <w:rPr>
           <w:rFonts w:ascii="Calibri" w:hAnsi="Calibri"/>
           <w:sz w:val="22"/>
         </w:rPr>
-        <w:t>Proses otentikasi khusus bagi akun dengan peran (role) Admin menggunakan panel masuk internal untuk memperoleh token akses administratif tingkat tinggi yang divalidasi ketat oleh sistem keamanan backend.</w:t>
+        <w:t>ini membatasi akses ke pusat kendali sistem utama hanya untuk personel tim internal perusahaan yang memiliki otoritas tinggi.</w:t>
       </w:r>
     </w:p>
     <w:p>
       <w:pPr>
-        <w:spacing w:after="120"/>
-        <w:ind w:left="360"/>
+        <w:pStyle w:val="ListBullet2"/>
       </w:pPr>
       <w:r>
         <w:rPr>
@@ -1277,20 +1461,19 @@
           <w:b/>
           <w:sz w:val="22"/>
         </w:rPr>
-        <w:t xml:space="preserve">UC-12: Kelola Data Master Kategori Sampah: </w:t>
+        <w:t xml:space="preserve">Login &amp; Sesi Gudang Data: </w:t>
       </w:r>
       <w:r>
         <w:rPr>
           <w:rFonts w:ascii="Calibri" w:hAnsi="Calibri"/>
           <w:sz w:val="22"/>
         </w:rPr>
-        <w:t>Admin bertanggung jawab penuh untuk mengelola master data kategori sampah di dalam database (seperti menambah jenis sampah baru, memperbarui ikon kategori, atau menonaktifkan kategori yang tidak relevan) yang nantinya diakses oleh seluruh Pengepul untuk katalog harga mereka.</w:t>
+        <w:t>Proses verifikasi kredensial berlapis bagi admin untuk masuk ke *back-office* atau panel kontrol pusat yang terhubung langsung dengan basis data utama.</w:t>
       </w:r>
     </w:p>
     <w:p>
       <w:pPr>
-        <w:spacing w:after="120"/>
-        <w:ind w:left="360"/>
+        <w:pStyle w:val="ListBullet"/>
       </w:pPr>
       <w:r>
         <w:rPr>
@@ -1298,14 +1481,100 @@
           <w:b/>
           <w:sz w:val="22"/>
         </w:rPr>
-        <w:t xml:space="preserve">UC-23: Monitoring Seluruh Transaksi Platform: </w:t>
+        <w:t>Manajemen Data Master</w:t>
+      </w:r>
+    </w:p>
+    <w:p>
+      <w:pPr>
+        <w:pStyle w:val="ListBullet2"/>
+      </w:pPr>
+      <w:r>
+        <w:rPr>
+          <w:rFonts w:ascii="Calibri" w:hAnsi="Calibri"/>
+          <w:i/>
+          <w:sz w:val="22"/>
+        </w:rPr>
+        <w:t xml:space="preserve">Use case </w:t>
       </w:r>
       <w:r>
         <w:rPr>
           <w:rFonts w:ascii="Calibri" w:hAnsi="Calibri"/>
           <w:sz w:val="22"/>
         </w:rPr>
-        <w:t>Admin memiliki akses eksklusif ke dashboard pemantauan menyeluruh untuk mengawasi status semua transaksi berjalan, menganalisis grafik volume daur ulang kota, serta menengahi sengketa (dispute) jika terjadi perselisihan rating atau ketidakjujuran timbangan antar pengguna.</w:t>
+        <w:t>ini digunakan oleh admin untuk menjaga standarisasi dan keseragaman data di seluruh platform agar tidak terjadi tumpang tindih informasi.</w:t>
+      </w:r>
+    </w:p>
+    <w:p>
+      <w:pPr>
+        <w:pStyle w:val="ListBullet2"/>
+      </w:pPr>
+      <w:r>
+        <w:rPr>
+          <w:rFonts w:ascii="Calibri" w:hAnsi="Calibri"/>
+          <w:b/>
+          <w:sz w:val="22"/>
+        </w:rPr>
+        <w:t xml:space="preserve">Kelola Data Master Kategori Sampah: </w:t>
+      </w:r>
+      <w:r>
+        <w:rPr>
+          <w:rFonts w:ascii="Calibri" w:hAnsi="Calibri"/>
+          <w:sz w:val="22"/>
+        </w:rPr>
+        <w:t>Memberikan hak kepada admin untuk menambah jenis kategori sampah baru secara global (seperti jenis plastik baru), mengedit nama kategori, atau menghapus opsi yang sudah tidak relevan di dalam sistem.</w:t>
+      </w:r>
+    </w:p>
+    <w:p>
+      <w:pPr>
+        <w:pStyle w:val="ListBullet"/>
+      </w:pPr>
+      <w:r>
+        <w:rPr>
+          <w:rFonts w:ascii="Calibri" w:hAnsi="Calibri"/>
+          <w:b/>
+          <w:sz w:val="22"/>
+        </w:rPr>
+        <w:t>Pengawasan Sistem</w:t>
+      </w:r>
+    </w:p>
+    <w:p>
+      <w:pPr>
+        <w:pStyle w:val="ListBullet2"/>
+      </w:pPr>
+      <w:r>
+        <w:rPr>
+          <w:rFonts w:ascii="Calibri" w:hAnsi="Calibri"/>
+          <w:i/>
+          <w:sz w:val="22"/>
+        </w:rPr>
+        <w:t xml:space="preserve">Use case </w:t>
+      </w:r>
+      <w:r>
+        <w:rPr>
+          <w:rFonts w:ascii="Calibri" w:hAnsi="Calibri"/>
+          <w:sz w:val="22"/>
+        </w:rPr>
+        <w:t>ini menempatkan admin sebagai pengawas ekosistem untuk memastikan seluruh kegiatan transaksi berjalan lancar tanpa adanya kecurangan, manipulasi data, atau perselisihan.</w:t>
+      </w:r>
+    </w:p>
+    <w:p>
+      <w:pPr>
+        <w:pStyle w:val="ListBullet2"/>
+      </w:pPr>
+      <w:r>
+        <w:rPr>
+          <w:rFonts w:ascii="Calibri" w:hAnsi="Calibri"/>
+          <w:b/>
+          <w:sz w:val="22"/>
+        </w:rPr>
+        <w:t xml:space="preserve">Monitoring Seluruh Transaksi: </w:t>
+      </w:r>
+      <w:r>
+        <w:rPr>
+          <w:rFonts w:ascii="Calibri" w:hAnsi="Calibri"/>
+          <w:sz w:val="22"/>
+        </w:rPr>
+        <w:t>Dasbor khusus yang menampilkan grafik, arus perputaran sampah, status pemesanan yang sedang berjalan, serta log transaksi aktif secara nasional demi menjaga keamanan dan stabilitas bisnis.</w:t>
       </w:r>
     </w:p>
     <w:p>
@@ -1677,73 +1946,56 @@
     <w:p>
       <w:pPr>
         <w:spacing w:line="240" w:lineRule="auto"/>
-        <w:jc w:val="left"/>
+        <w:jc w:val="center"/>
+      </w:pPr>
+      <w:r/>
+      <w:r>
+        <w:drawing>
+          <wp:inline xmlns:a="http://schemas.openxmlformats.org/drawingml/2006/main" xmlns:pic="http://schemas.openxmlformats.org/drawingml/2006/picture">
+            <wp:extent cx="4572000" cy="2699509"/>
+            <wp:docPr id="11" name="Picture 11"/>
+            <wp:cNvGraphicFramePr>
+              <a:graphicFrameLocks noChangeAspect="1"/>
+            </wp:cNvGraphicFramePr>
+            <a:graphic>
+              <a:graphicData uri="http://schemas.openxmlformats.org/drawingml/2006/picture">
+                <pic:pic>
+                  <pic:nvPicPr>
+                    <pic:cNvPr id="0" name="flow.png"/>
+                    <pic:cNvPicPr/>
+                  </pic:nvPicPr>
+                  <pic:blipFill>
+                    <a:blip r:embed="rId19"/>
+                    <a:stretch>
+                      <a:fillRect/>
+                    </a:stretch>
+                  </pic:blipFill>
+                  <pic:spPr>
+                    <a:xfrm>
+                      <a:off x="0" y="0"/>
+                      <a:ext cx="4572000" cy="2699509"/>
+                    </a:xfrm>
+                    <a:prstGeom prst="rect"/>
+                  </pic:spPr>
+                </pic:pic>
+              </a:graphicData>
+            </a:graphic>
+          </wp:inline>
+        </w:drawing>
+      </w:r>
+    </w:p>
+    <w:p>
+      <w:pPr>
+        <w:jc w:val="center"/>
       </w:pPr>
       <w:r>
         <w:rPr>
-          <w:rFonts w:ascii="Consolas" w:hAnsi="Consolas"/>
-          <w:b/>
-          <w:sz w:val="18"/>
+          <w:rFonts w:ascii="Calibri" w:hAnsi="Calibri"/>
+          <w:i/>
+          <w:color w:val="64748B"/>
+          <w:sz w:val="20"/>
         </w:rPr>
-        <w:t xml:space="preserve">  [ Mulai: Pencarian Pengepul Terdekat ]</w:t>
-        <w:br/>
-        <w:t xml:space="preserve">                     │</w:t>
-        <w:br/>
-        <w:t xml:space="preserve">                     ▼</w:t>
-        <w:br/>
-        <w:t xml:space="preserve">      [ Tangkap Koordinat GPS User ] ──► (lat, lng)</w:t>
-        <w:br/>
-        <w:t xml:space="preserve">                     │</w:t>
-        <w:br/>
-        <w:t xml:space="preserve">                     ▼</w:t>
-        <w:br/>
-        <w:t xml:space="preserve">      [ Dapatkan data categoryId ]</w:t>
-        <w:br/>
-        <w:t xml:space="preserve">                     │</w:t>
-        <w:br/>
-        <w:t xml:space="preserve">                     ▼</w:t>
-        <w:br/>
-        <w:t xml:space="preserve">      [ Eksekusi Query Spasial PostGIS ]</w:t>
-        <w:br/>
-        <w:t xml:space="preserve">      - ST_DWithin(u.location, UserPoint, cp.radiusKm * 1000)</w:t>
-        <w:br/>
-        <w:t xml:space="preserve">      - Filter cp.isOpen = true &amp; cc.categoryId = categoryId</w:t>
-        <w:br/>
-        <w:t xml:space="preserve">                     │</w:t>
-        <w:br/>
-        <w:t xml:space="preserve">                     ▼</w:t>
-        <w:br/>
-        <w:t xml:space="preserve">             Apakah Pengepul</w:t>
-        <w:br/>
-        <w:t xml:space="preserve">                Ditemukan?</w:t>
-        <w:br/>
-        <w:t xml:space="preserve">               /         \</w:t>
-        <w:br/>
-        <w:t xml:space="preserve">             YA           TIDAK</w:t>
-        <w:br/>
-        <w:t xml:space="preserve">            /               \</w:t>
-        <w:br/>
-        <w:t xml:space="preserve">           ▼                 ▼</w:t>
-        <w:br/>
-        <w:t xml:space="preserve">  [ Lakukan Sorting: ]    [ Kembalikan Error 404:</w:t>
-        <w:br/>
-        <w:t xml:space="preserve">  1. isPremium DESC        "Tidak ada pengepul terdekat"]</w:t>
-        <w:br/>
-        <w:t xml:space="preserve">  2. distance ASC            </w:t>
-        <w:br/>
-        <w:t xml:space="preserve">  3. avgRating DESC          </w:t>
-        <w:br/>
-        <w:t xml:space="preserve">           │</w:t>
-        <w:br/>
-        <w:t xml:space="preserve">           ▼</w:t>
-        <w:br/>
-        <w:t xml:space="preserve">  [ Kirim Response List Pengepul ]</w:t>
-        <w:br/>
-        <w:t xml:space="preserve">           │</w:t>
-        <w:br/>
-        <w:t xml:space="preserve">           ▼</w:t>
-        <w:br/>
-        <w:t xml:space="preserve">    [ Selesai ]</w:t>
+        <w:t>Gambar 3.4: Flowchart Logika Discovery Spasial Pengepul Rongsok.in</w:t>
       </w:r>
     </w:p>
     <w:p>

</xml_diff>